<commit_message>
Docs: Update documentation in MD, HTML, and DOCX formats to clearly explain check-in thresholds, lateness rules, and Demo Account bypass exception
</commit_message>
<xml_diff>
--- a/DOKUMENTASI_SISTEM_SIMKAB.docx
+++ b/DOKUMENTASI_SISTEM_SIMKAB.docx
@@ -2479,6 +2479,328 @@
     </w:p>
     <w:p>
       <w:pPr>
+        <w:pStyle w:val="Heading3"/>
+        <w:keepNext/>
+        <w:spacing w:before="240" w:after="120"/>
+      </w:pPr>
+      <w:r>
+        <w:rPr>
+          <w:rFonts w:ascii="Arial" w:hAnsi="Arial"/>
+          <w:b/>
+          <w:color w:val="646464"/>
+          <w:sz w:val="24"/>
+        </w:rPr>
+        <w:t>5.1.1 Aturan Batas Waktu &amp; Keterlambatan Absensi (Lateness Rules)</w:t>
+      </w:r>
+    </w:p>
+    <w:p>
+      <w:r>
+        <w:t>Sistem secara otomatis mengalkulasi status kehadiran karyawan ketika mereka melakukan Check-In berdasarkan zona waktu WITA (Asia/Makassar) dengan pembagian batasan parameter berikut:</w:t>
+      </w:r>
+    </w:p>
+    <w:tbl>
+      <w:tblPr>
+        <w:tblW w:type="auto" w:w="0"/>
+        <w:jc w:val="center"/>
+        <w:tblLook w:firstColumn="1" w:firstRow="1" w:lastColumn="0" w:lastRow="0" w:noHBand="0" w:noVBand="1" w:val="04A0"/>
+      </w:tblPr>
+      <w:tblGrid>
+        <w:gridCol w:w="3120"/>
+        <w:gridCol w:w="3120"/>
+        <w:gridCol w:w="3120"/>
+      </w:tblGrid>
+      <w:tr>
+        <w:tc>
+          <w:tcPr>
+            <w:tcW w:type="dxa" w:w="3120"/>
+            <w:shd w:fill="161b2d"/>
+            <w:tcMar>
+              <w:top w:w="100" w:type="dxa"/>
+              <w:bottom w:w="100" w:type="dxa"/>
+              <w:left w:w="150" w:type="dxa"/>
+              <w:right w:w="150" w:type="dxa"/>
+            </w:tcMar>
+          </w:tcPr>
+          <w:p>
+            <w:r>
+              <w:rPr>
+                <w:b/>
+                <w:color w:val="FFFFFF"/>
+              </w:rPr>
+              <w:t>Kategori Waktu Check-In</w:t>
+            </w:r>
+          </w:p>
+        </w:tc>
+        <w:tc>
+          <w:tcPr>
+            <w:tcW w:type="dxa" w:w="3120"/>
+            <w:shd w:fill="161b2d"/>
+            <w:tcMar>
+              <w:top w:w="100" w:type="dxa"/>
+              <w:bottom w:w="100" w:type="dxa"/>
+              <w:left w:w="150" w:type="dxa"/>
+              <w:right w:w="150" w:type="dxa"/>
+            </w:tcMar>
+          </w:tcPr>
+          <w:p>
+            <w:r>
+              <w:rPr>
+                <w:b/>
+                <w:color w:val="FFFFFF"/>
+              </w:rPr>
+              <w:t>Status Kehadiran</w:t>
+            </w:r>
+          </w:p>
+        </w:tc>
+        <w:tc>
+          <w:tcPr>
+            <w:tcW w:type="dxa" w:w="3120"/>
+            <w:shd w:fill="161b2d"/>
+            <w:tcMar>
+              <w:top w:w="100" w:type="dxa"/>
+              <w:bottom w:w="100" w:type="dxa"/>
+              <w:left w:w="150" w:type="dxa"/>
+              <w:right w:w="150" w:type="dxa"/>
+            </w:tcMar>
+          </w:tcPr>
+          <w:p>
+            <w:r>
+              <w:rPr>
+                <w:b/>
+                <w:color w:val="FFFFFF"/>
+              </w:rPr>
+              <w:t>Keterangan Konsekuensi</w:t>
+            </w:r>
+          </w:p>
+        </w:tc>
+      </w:tr>
+      <w:tr>
+        <w:tc>
+          <w:tcPr>
+            <w:tcW w:type="dxa" w:w="3120"/>
+            <w:tcMar>
+              <w:top w:w="100" w:type="dxa"/>
+              <w:bottom w:w="100" w:type="dxa"/>
+              <w:left w:w="150" w:type="dxa"/>
+              <w:right w:w="150" w:type="dxa"/>
+            </w:tcMar>
+          </w:tcPr>
+          <w:p>
+            <w:r>
+              <w:rPr>
+                <w:b/>
+              </w:rPr>
+              <w:t>00:00:00 s.d 08:00:00 pagi</w:t>
+            </w:r>
+          </w:p>
+        </w:tc>
+        <w:tc>
+          <w:tcPr>
+            <w:tcW w:type="dxa" w:w="3120"/>
+            <w:tcMar>
+              <w:top w:w="100" w:type="dxa"/>
+              <w:bottom w:w="100" w:type="dxa"/>
+              <w:left w:w="150" w:type="dxa"/>
+              <w:right w:w="150" w:type="dxa"/>
+            </w:tcMar>
+          </w:tcPr>
+          <w:p>
+            <w:r>
+              <w:rPr>
+                <w:color w:val="10B981"/>
+              </w:rPr>
+              <w:t>Hadir (Tepat Waktu)</w:t>
+            </w:r>
+          </w:p>
+        </w:tc>
+        <w:tc>
+          <w:tcPr>
+            <w:tcW w:type="dxa" w:w="3120"/>
+            <w:tcMar>
+              <w:top w:w="100" w:type="dxa"/>
+              <w:bottom w:w="100" w:type="dxa"/>
+              <w:left w:w="150" w:type="dxa"/>
+              <w:right w:w="150" w:type="dxa"/>
+            </w:tcMar>
+          </w:tcPr>
+          <w:p>
+            <w:r>
+              <w:t>Kehadiran normal, tidak dikenakan sanksi/potongan gaji.</w:t>
+            </w:r>
+          </w:p>
+        </w:tc>
+      </w:tr>
+      <w:tr>
+        <w:tc>
+          <w:tcPr>
+            <w:tcW w:type="dxa" w:w="3120"/>
+            <w:tcMar>
+              <w:top w:w="100" w:type="dxa"/>
+              <w:bottom w:w="100" w:type="dxa"/>
+              <w:left w:w="150" w:type="dxa"/>
+              <w:right w:w="150" w:type="dxa"/>
+            </w:tcMar>
+          </w:tcPr>
+          <w:p>
+            <w:r>
+              <w:rPr>
+                <w:b/>
+              </w:rPr>
+              <w:t>08:00:01 s.d 09:00:00 pagi</w:t>
+            </w:r>
+          </w:p>
+        </w:tc>
+        <w:tc>
+          <w:tcPr>
+            <w:tcW w:type="dxa" w:w="3120"/>
+            <w:tcMar>
+              <w:top w:w="100" w:type="dxa"/>
+              <w:bottom w:w="100" w:type="dxa"/>
+              <w:left w:w="150" w:type="dxa"/>
+              <w:right w:w="150" w:type="dxa"/>
+            </w:tcMar>
+          </w:tcPr>
+          <w:p>
+            <w:r>
+              <w:rPr>
+                <w:color w:val="F59E0B"/>
+              </w:rPr>
+              <w:t>Terlambat</w:t>
+            </w:r>
+          </w:p>
+        </w:tc>
+        <w:tc>
+          <w:tcPr>
+            <w:tcW w:type="dxa" w:w="3120"/>
+            <w:tcMar>
+              <w:top w:w="100" w:type="dxa"/>
+              <w:bottom w:w="100" w:type="dxa"/>
+              <w:left w:w="150" w:type="dxa"/>
+              <w:right w:w="150" w:type="dxa"/>
+            </w:tcMar>
+          </w:tcPr>
+          <w:p>
+            <w:r>
+              <w:t>Status tercatat terlambat dan dikenakan denda denda absensi oleh HRD.</w:t>
+            </w:r>
+          </w:p>
+        </w:tc>
+      </w:tr>
+      <w:tr>
+        <w:tc>
+          <w:tcPr>
+            <w:tcW w:type="dxa" w:w="3120"/>
+            <w:tcMar>
+              <w:top w:w="100" w:type="dxa"/>
+              <w:bottom w:w="100" w:type="dxa"/>
+              <w:left w:w="150" w:type="dxa"/>
+              <w:right w:w="150" w:type="dxa"/>
+            </w:tcMar>
+          </w:tcPr>
+          <w:p>
+            <w:r>
+              <w:rPr>
+                <w:b/>
+              </w:rPr>
+              <w:t>Di atas 09:00:00 pagi</w:t>
+            </w:r>
+          </w:p>
+        </w:tc>
+        <w:tc>
+          <w:tcPr>
+            <w:tcW w:type="dxa" w:w="3120"/>
+            <w:tcMar>
+              <w:top w:w="100" w:type="dxa"/>
+              <w:bottom w:w="100" w:type="dxa"/>
+              <w:left w:w="150" w:type="dxa"/>
+              <w:right w:w="150" w:type="dxa"/>
+            </w:tcMar>
+          </w:tcPr>
+          <w:p>
+            <w:r>
+              <w:rPr>
+                <w:color w:val="EF4444"/>
+              </w:rPr>
+              <w:t>Tidak Hadir (Alfa)</w:t>
+            </w:r>
+          </w:p>
+        </w:tc>
+        <w:tc>
+          <w:tcPr>
+            <w:tcW w:type="dxa" w:w="3120"/>
+            <w:tcMar>
+              <w:top w:w="100" w:type="dxa"/>
+              <w:bottom w:w="100" w:type="dxa"/>
+              <w:left w:w="150" w:type="dxa"/>
+              <w:right w:w="150" w:type="dxa"/>
+            </w:tcMar>
+          </w:tcPr>
+          <w:p>
+            <w:r>
+              <w:t>Dianggap mangkir kerja, otomatis dicatat merah sebagai tidak hadir di sistem.</w:t>
+            </w:r>
+          </w:p>
+        </w:tc>
+      </w:tr>
+      <w:tr>
+        <w:tc>
+          <w:tcPr>
+            <w:tcW w:type="dxa" w:w="3120"/>
+            <w:tcMar>
+              <w:top w:w="100" w:type="dxa"/>
+              <w:bottom w:w="100" w:type="dxa"/>
+              <w:left w:w="150" w:type="dxa"/>
+              <w:right w:w="150" w:type="dxa"/>
+            </w:tcMar>
+          </w:tcPr>
+          <w:p>
+            <w:r>
+              <w:rPr>
+                <w:b/>
+              </w:rPr>
+              <w:t>Demo Bypass (Khusus akun.demo)</w:t>
+            </w:r>
+          </w:p>
+        </w:tc>
+        <w:tc>
+          <w:tcPr>
+            <w:tcW w:type="dxa" w:w="3120"/>
+            <w:tcMar>
+              <w:top w:w="100" w:type="dxa"/>
+              <w:bottom w:w="100" w:type="dxa"/>
+              <w:left w:w="150" w:type="dxa"/>
+              <w:right w:w="150" w:type="dxa"/>
+            </w:tcMar>
+          </w:tcPr>
+          <w:p>
+            <w:r>
+              <w:rPr>
+                <w:color w:val="10B981"/>
+              </w:rPr>
+              <w:t>Hadir (Selalu)</w:t>
+            </w:r>
+          </w:p>
+        </w:tc>
+        <w:tc>
+          <w:tcPr>
+            <w:tcW w:type="dxa" w:w="3120"/>
+            <w:tcMar>
+              <w:top w:w="100" w:type="dxa"/>
+              <w:bottom w:w="100" w:type="dxa"/>
+              <w:left w:w="150" w:type="dxa"/>
+              <w:right w:w="150" w:type="dxa"/>
+            </w:tcMar>
+          </w:tcPr>
+          <w:p>
+            <w:r>
+              <w:t>Bypass instan GPS dan waktu khusus untuk simulasi presentasi aplikasi.</w:t>
+            </w:r>
+          </w:p>
+        </w:tc>
+      </w:tr>
+    </w:tbl>
+    <w:p>
+      <w:pPr>
         <w:pStyle w:val="Heading2"/>
         <w:keepNext/>
         <w:spacing w:before="360" w:after="160"/>

</xml_diff>